<commit_message>
Fix three paper inconsistencies
- Control channel: III-B no longer calls the MQTT control channel
  "authenticated"; it now states the deployed broker channel is
  unauthenticated until GMCP secures it (matches III-A and the live
  state, allow_anonymous true; broker auth lockdown still pending).
- Future work: replaced "add exposure regrowth with hold/restore" with
  "add a restore action"; the v4 environment already models regrowth and
  a hold action (IV-C).
- IDS-noise claim: VI-D now reports the result the Limitations and
  Conclusion referred to — under observation noise 0.20, learned policies
  allow significantly fewer break-ins than greedy (PPO 1.11 vs 1.44,
  -0.33, 95% CI [-0.63, -0.05]); from robustness_v4.json / logs e22.

Co-Authored-By: Claude Opus 5.5 <noreply@anthropic.com>
</commit_message>
<xml_diff>
--- a/paper/GhostNet_v4_IEEE.docx
+++ b/paper/GhostNet_v4_IEEE.docx
@@ -625,7 +625,7 @@
           <w:smallCaps w:val="0"/>
           <w:sz w:val="20"/>
         </w:rPr>
-        <w:t>Fig. 1 shows the architecture. A simulated ESP32-class infusion pump streams telemetry over MQTT to a Mosquitto broker on an AWS EC2 instance. A threat-state engine combines live threat intelligence and IDS-estimated exposure into a 12-dimensional state vector. A single learned policy maps the state to one of seven actions (six mutations and hold) and dispatches it to a cloud executor (AWS SDK) or an IoT executor (SSH and an authenticated MQTT control channel). Each executor applies the mutation to live infrastructure and re-reads the target to confirm it; a mutation ledger records old value, new value and confirmation, supplies the current live configuration back to the executors, and rolls back anything unconfirmed. A separate evaluation path drives a MITRE CALDERA operation and a replayed ATT&amp;CK kill chain.</w:t>
+        <w:t>Fig. 1 shows the architecture. A simulated ESP32-class infusion pump streams telemetry over MQTT to a Mosquitto broker on an AWS EC2 instance. A threat-state engine combines live threat intelligence and IDS-estimated exposure into a 12-dimensional state vector. A single learned policy maps the state to one of seven actions (six mutations and hold) and dispatches it to a cloud executor (AWS SDK) or an IoT executor (an authenticated SSH session and an MQTT control channel that, in the deployed broker, is unauthenticated until GMCP secures it at the message layer, Section V-C). Each executor applies the mutation to live infrastructure and re-reads the target to confirm it; a mutation ledger records old value, new value and confirmation, supplies the current live configuration back to the executors, and rolls back anything unconfirmed. A separate evaluation path drives a MITRE CALDERA operation and a replayed ATT&amp;CK kill chain.</w:t>
       </w:r>
     </w:p>
     <w:p>
@@ -4895,7 +4895,7 @@
           <w:smallCaps w:val="0"/>
           <w:sz w:val="20"/>
         </w:rPr>
-        <w:t xml:space="preserve"> as that effect is weakened. When the firewall action is made ineffective, PPO break-ins rise from 0.69 to 4.04 per game — worse than round-robin — while the greedy rule, which never uses it, is unchanged at 0.88. This is a silent failure: in the nominal environment the policy looks excellent. Training under uncertainty about the action's effect (domain randomization over its strength [21]) reduces the worst case to 1.29 break-ins at a small nominal cost (0.92 vs 0.69). Across all nine perturbations we tested — attacker speed, exploit delay, IDS noise, firewall effect — one property held without exception: every learned policy disrupted the hospital less than greedy.</w:t>
+        <w:t xml:space="preserve"> as that effect is weakened. When the firewall action is made ineffective, PPO break-ins rise from 0.69 to 4.04 per game — worse than round-robin — while the greedy rule, which never uses it, is unchanged at 0.88. This is a silent failure: in the nominal environment the policy looks excellent. Training under uncertainty about the action's effect (domain randomization over its strength [21]) reduces the worst case to 1.29 break-ins at a small nominal cost (0.92 vs 0.69). The robustness sweep also surfaced one regime where learning helps on security: under the highest IDS noise (observation noise 0.20) the learned policies allowed significantly fewer break-ins than greedy (PPO 1.11 vs 1.44 per game, −0.33, 95% CI [−0.63, −0.05]; DQN 1.04), plausibly because a greedy rule chases the noisiest apparent surface while the policy has learned to discount the noise. Across all nine perturbations we tested — attacker speed, exploit delay, IDS noise, firewall effect — one property held without exception: every learned policy disrupted the hospital less than greedy.</w:t>
       </w:r>
     </w:p>
     <w:p>
@@ -5434,7 +5434,7 @@
           <w:smallCaps w:val="0"/>
           <w:sz w:val="20"/>
         </w:rPr>
-        <w:t>We presented GhostNet, a verified-at-target, dual-domain moving target defense for hospital IoMT-to-cloud infrastructure, and used it to argue a methodological point: a learned MTD can look like a working defense while providing none, and only end-to-end verification — at the target, the device and the attacker's side — distinguishes the two. Evaluated by attacker outcome across ten seeds per method, a learned policy did not stop more break-ins than a one-line heuristic but disrupted the hospital less; and we characterized three silent failure modes, giving a signed two-phase protocol that removes the availability failure. Future work will complete live validation of the partial actions and the host-firewall and GMCP paths on the deployment, replace the modeled attacker with a live adaptive red team, add exposure regrowth with hold/restore so mutation timing is fully learnable, and scale beyond a single segment and device. We also intend to make cloud-IP and API-path rotation live (Elastic IP and a reverse proxy) so that every action the policy can select is executed and confirmed on real infrastructure.</w:t>
+        <w:t>We presented GhostNet, a verified-at-target, dual-domain moving target defense for hospital IoMT-to-cloud infrastructure, and used it to argue a methodological point: a learned MTD can look like a working defense while providing none, and only end-to-end verification — at the target, the device and the attacker's side — distinguishes the two. Evaluated by attacker outcome across ten seeds per method, a learned policy did not stop more break-ins than a one-line heuristic but disrupted the hospital less; and we characterized three silent failure modes, giving a signed two-phase protocol that removes the availability failure. Future work will complete live validation of the partial actions and the host-firewall and GMCP paths on the deployment, replace the modeled attacker with a live adaptive red team, add a restore action (the environment already models exposure regrowth and a hold action) so the full mutation lifecycle is learnable, and scale beyond a single segment and device. We also intend to make cloud-IP and API-path rotation live (Elastic IP and a reverse proxy) so that every action the policy can select is executed and confirmed on real infrastructure.</w:t>
       </w:r>
     </w:p>
     <w:p>

</xml_diff>